<commit_message>
Mes 3: setup unificado — app React + GAS + GitHub Actions
- Estructura limpia en raíz (package.json, vite.config.js, eslint.config.js)
- src/ con App.jsx, hooks/useListas.js, utils/api|municipios|validaciones
- Página de inicio conectada al GAS para verificar estado del sistema
- Deploy workflow en .github/workflows/deploy.yml
- Eliminados admin/, formulario/ y src/admin/ + src/formulario/ del refactor anterior

Co-Authored-By: Claude Sonnet 4.6 <noreply@anthropic.com>
</commit_message>
<xml_diff>
--- a/docs/Plan_Implementacion_Seguimiento_Egresados.docx
+++ b/docs/Plan_Implementacion_Seguimiento_Egresados.docx
@@ -154,7 +154,15 @@
         <w:spacing w:before="60" w:after="60"/>
       </w:pPr>
       <w:r>
-        <w:t>El plan se estructura en nueve meses de trabajo, distribuidos en cuatro fases: Fundamentos, Desarrollo, Dashboard y Cierre.</w:t>
+        <w:t xml:space="preserve">El plan se estructura en nueve meses de trabajo, distribuidos en cuatro fases: Fundamentos, Desarrollo, </w:t>
+      </w:r>
+      <w:proofErr w:type="spellStart"/>
+      <w:r>
+        <w:t>Dashboard</w:t>
+      </w:r>
+      <w:proofErr w:type="spellEnd"/>
+      <w:r>
+        <w:t xml:space="preserve"> y Cierre.</w:t>
       </w:r>
     </w:p>
     <w:p>
@@ -474,13 +482,23 @@
             <w:vAlign w:val="center"/>
           </w:tcPr>
           <w:p>
-            <w:r>
-              <w:rPr>
-                <w:color w:val="1A1A1A"/>
-                <w:sz w:val="20"/>
-                <w:szCs w:val="20"/>
-              </w:rPr>
-              <w:t>React + Vite — GitHub Pages</w:t>
+            <w:proofErr w:type="spellStart"/>
+            <w:r>
+              <w:rPr>
+                <w:color w:val="1A1A1A"/>
+                <w:sz w:val="20"/>
+                <w:szCs w:val="20"/>
+              </w:rPr>
+              <w:t>React</w:t>
+            </w:r>
+            <w:proofErr w:type="spellEnd"/>
+            <w:r>
+              <w:rPr>
+                <w:color w:val="1A1A1A"/>
+                <w:sz w:val="20"/>
+                <w:szCs w:val="20"/>
+              </w:rPr>
+              <w:t xml:space="preserve"> + Vite — GitHub Pages</w:t>
             </w:r>
           </w:p>
         </w:tc>
@@ -748,13 +766,23 @@
             <w:vAlign w:val="center"/>
           </w:tcPr>
           <w:p>
-            <w:r>
-              <w:rPr>
-                <w:color w:val="1A1A1A"/>
-                <w:sz w:val="20"/>
-                <w:szCs w:val="20"/>
-              </w:rPr>
-              <w:t>React + Vite — GitHub Pages</w:t>
+            <w:proofErr w:type="spellStart"/>
+            <w:r>
+              <w:rPr>
+                <w:color w:val="1A1A1A"/>
+                <w:sz w:val="20"/>
+                <w:szCs w:val="20"/>
+              </w:rPr>
+              <w:t>React</w:t>
+            </w:r>
+            <w:proofErr w:type="spellEnd"/>
+            <w:r>
+              <w:rPr>
+                <w:color w:val="1A1A1A"/>
+                <w:sz w:val="20"/>
+                <w:szCs w:val="20"/>
+              </w:rPr>
+              <w:t xml:space="preserve"> + Vite — GitHub Pages</w:t>
             </w:r>
           </w:p>
         </w:tc>
@@ -1838,7 +1866,15 @@
         <w:spacing w:before="60" w:after="60"/>
       </w:pPr>
       <w:r>
-        <w:t>El desarrollo del sistema está planificado para un periodo de nueve meses, organizados en cuatro fases. A continuación se presenta el cronograma general con las actividades y entregables de cada mes.</w:t>
+        <w:t xml:space="preserve">El desarrollo del sistema está planificado para un periodo de nueve meses, organizados en cuatro fases. A </w:t>
+      </w:r>
+      <w:proofErr w:type="gramStart"/>
+      <w:r>
+        <w:t>continuación</w:t>
+      </w:r>
+      <w:proofErr w:type="gramEnd"/>
+      <w:r>
+        <w:t xml:space="preserve"> se presenta el cronograma general con las actividades y entregables de cada mes.</w:t>
       </w:r>
     </w:p>
     <w:p>
@@ -2339,13 +2375,23 @@
             <w:vAlign w:val="center"/>
           </w:tcPr>
           <w:p>
-            <w:r>
-              <w:rPr>
-                <w:color w:val="1A1A1A"/>
-                <w:sz w:val="20"/>
-                <w:szCs w:val="20"/>
-              </w:rPr>
-              <w:t>Setup del proyecto + GAS</w:t>
+            <w:proofErr w:type="spellStart"/>
+            <w:r>
+              <w:rPr>
+                <w:color w:val="1A1A1A"/>
+                <w:sz w:val="20"/>
+                <w:szCs w:val="20"/>
+              </w:rPr>
+              <w:t>Setup</w:t>
+            </w:r>
+            <w:proofErr w:type="spellEnd"/>
+            <w:r>
+              <w:rPr>
+                <w:color w:val="1A1A1A"/>
+                <w:sz w:val="20"/>
+                <w:szCs w:val="20"/>
+              </w:rPr>
+              <w:t xml:space="preserve"> del proyecto + GAS</w:t>
             </w:r>
           </w:p>
         </w:tc>
@@ -2679,6 +2725,7 @@
             <w:vAlign w:val="center"/>
           </w:tcPr>
           <w:p>
+            <w:proofErr w:type="spellStart"/>
             <w:r>
               <w:rPr>
                 <w:color w:val="1A1A1A"/>
@@ -2687,6 +2734,7 @@
               </w:rPr>
               <w:t>Dashboard</w:t>
             </w:r>
+            <w:proofErr w:type="spellEnd"/>
           </w:p>
         </w:tc>
         <w:tc>
@@ -2714,7 +2762,25 @@
                 <w:sz w:val="20"/>
                 <w:szCs w:val="20"/>
               </w:rPr>
-              <w:t>Panel admin — estructura y datos</w:t>
+              <w:t xml:space="preserve">Panel </w:t>
+            </w:r>
+            <w:proofErr w:type="spellStart"/>
+            <w:r>
+              <w:rPr>
+                <w:color w:val="1A1A1A"/>
+                <w:sz w:val="20"/>
+                <w:szCs w:val="20"/>
+              </w:rPr>
+              <w:t>admin</w:t>
+            </w:r>
+            <w:proofErr w:type="spellEnd"/>
+            <w:r>
+              <w:rPr>
+                <w:color w:val="1A1A1A"/>
+                <w:sz w:val="20"/>
+                <w:szCs w:val="20"/>
+              </w:rPr>
+              <w:t xml:space="preserve"> — estructura y datos</w:t>
             </w:r>
           </w:p>
         </w:tc>
@@ -2743,7 +2809,25 @@
                 <w:sz w:val="20"/>
                 <w:szCs w:val="20"/>
               </w:rPr>
-              <w:t>Panel admin con tabla y detalle funcionando</w:t>
+              <w:t xml:space="preserve">Panel </w:t>
+            </w:r>
+            <w:proofErr w:type="spellStart"/>
+            <w:r>
+              <w:rPr>
+                <w:color w:val="1A1A1A"/>
+                <w:sz w:val="20"/>
+                <w:szCs w:val="20"/>
+              </w:rPr>
+              <w:t>admin</w:t>
+            </w:r>
+            <w:proofErr w:type="spellEnd"/>
+            <w:r>
+              <w:rPr>
+                <w:color w:val="1A1A1A"/>
+                <w:sz w:val="20"/>
+                <w:szCs w:val="20"/>
+              </w:rPr>
+              <w:t xml:space="preserve"> con tabla y detalle funcionando</w:t>
             </w:r>
           </w:p>
         </w:tc>
@@ -2802,6 +2886,7 @@
             <w:vAlign w:val="center"/>
           </w:tcPr>
           <w:p>
+            <w:proofErr w:type="spellStart"/>
             <w:r>
               <w:rPr>
                 <w:color w:val="1A1A1A"/>
@@ -2810,6 +2895,7 @@
               </w:rPr>
               <w:t>Dashboard</w:t>
             </w:r>
+            <w:proofErr w:type="spellEnd"/>
           </w:p>
         </w:tc>
         <w:tc>
@@ -2837,7 +2923,25 @@
                 <w:sz w:val="20"/>
                 <w:szCs w:val="20"/>
               </w:rPr>
-              <w:t>Panel admin — gráficas e indicadores</w:t>
+              <w:t xml:space="preserve">Panel </w:t>
+            </w:r>
+            <w:proofErr w:type="spellStart"/>
+            <w:r>
+              <w:rPr>
+                <w:color w:val="1A1A1A"/>
+                <w:sz w:val="20"/>
+                <w:szCs w:val="20"/>
+              </w:rPr>
+              <w:t>admin</w:t>
+            </w:r>
+            <w:proofErr w:type="spellEnd"/>
+            <w:r>
+              <w:rPr>
+                <w:color w:val="1A1A1A"/>
+                <w:sz w:val="20"/>
+                <w:szCs w:val="20"/>
+              </w:rPr>
+              <w:t xml:space="preserve"> — gráficas e indicadores</w:t>
             </w:r>
           </w:p>
         </w:tc>
@@ -2860,13 +2964,23 @@
             <w:vAlign w:val="center"/>
           </w:tcPr>
           <w:p>
-            <w:r>
-              <w:rPr>
-                <w:color w:val="1A1A1A"/>
-                <w:sz w:val="20"/>
-                <w:szCs w:val="20"/>
-              </w:rPr>
-              <w:t>Dashboard con gráficas completas y filtros</w:t>
+            <w:proofErr w:type="spellStart"/>
+            <w:r>
+              <w:rPr>
+                <w:color w:val="1A1A1A"/>
+                <w:sz w:val="20"/>
+                <w:szCs w:val="20"/>
+              </w:rPr>
+              <w:t>Dashboard</w:t>
+            </w:r>
+            <w:proofErr w:type="spellEnd"/>
+            <w:r>
+              <w:rPr>
+                <w:color w:val="1A1A1A"/>
+                <w:sz w:val="20"/>
+                <w:szCs w:val="20"/>
+              </w:rPr>
+              <w:t xml:space="preserve"> con gráficas completas y filtros</w:t>
             </w:r>
           </w:p>
         </w:tc>
@@ -3311,6 +3425,7 @@
             <w:vAlign w:val="center"/>
           </w:tcPr>
           <w:p>
+            <w:proofErr w:type="spellStart"/>
             <w:r>
               <w:rPr>
                 <w:b/>
@@ -3319,7 +3434,18 @@
                 <w:sz w:val="20"/>
                 <w:szCs w:val="20"/>
               </w:rPr>
-              <w:t>React + Vite</w:t>
+              <w:t>React</w:t>
+            </w:r>
+            <w:proofErr w:type="spellEnd"/>
+            <w:r>
+              <w:rPr>
+                <w:b/>
+                <w:bCs/>
+                <w:color w:val="155230"/>
+                <w:sz w:val="20"/>
+                <w:szCs w:val="20"/>
+              </w:rPr>
+              <w:t xml:space="preserve"> + Vite</w:t>
             </w:r>
           </w:p>
         </w:tc>
@@ -3841,12 +3967,27 @@
     </w:p>
     <w:p>
       <w:pPr>
+        <w:rPr>
+          <w:b/>
+          <w:bCs/>
+          <w:color w:val="155230"/>
+          <w:sz w:val="28"/>
+          <w:szCs w:val="28"/>
+        </w:rPr>
+      </w:pPr>
+      <w:r>
+        <w:br w:type="page"/>
+      </w:r>
+    </w:p>
+    <w:p>
+      <w:pPr>
         <w:pStyle w:val="Ttulo1"/>
         <w:pBdr>
           <w:bottom w:val="single" w:sz="6" w:space="4" w:color="1A5E38"/>
         </w:pBdr>
       </w:pPr>
       <w:r>
+        <w:lastRenderedPageBreak/>
         <w:t>8. Equipo responsable</w:t>
       </w:r>
     </w:p>
@@ -3911,7 +4052,6 @@
                 <w:sz w:val="20"/>
                 <w:szCs w:val="20"/>
               </w:rPr>
-              <w:lastRenderedPageBreak/>
               <w:t>Rol</w:t>
             </w:r>
           </w:p>
@@ -4172,15 +4312,7 @@
                 <w:sz w:val="20"/>
                 <w:szCs w:val="20"/>
               </w:rPr>
-              <w:t xml:space="preserve">Comité de Cafeteros – Área de </w:t>
-            </w:r>
-            <w:r>
-              <w:rPr>
-                <w:color w:val="1A1A1A"/>
-                <w:sz w:val="20"/>
-                <w:szCs w:val="20"/>
-              </w:rPr>
-              <w:t>Educación</w:t>
+              <w:t>Comité de Cafeteros – Área de Educación</w:t>
             </w:r>
           </w:p>
         </w:tc>
@@ -4281,15 +4413,7 @@
                 <w:sz w:val="20"/>
                 <w:szCs w:val="20"/>
               </w:rPr>
-              <w:t xml:space="preserve">Comité de Cafeteros – Área de </w:t>
-            </w:r>
-            <w:r>
-              <w:rPr>
-                <w:color w:val="1A1A1A"/>
-                <w:sz w:val="20"/>
-                <w:szCs w:val="20"/>
-              </w:rPr>
-              <w:t>Educación</w:t>
+              <w:t>Comité de Cafeteros – Área de Educación</w:t>
             </w:r>
           </w:p>
         </w:tc>
@@ -4365,7 +4489,49 @@
           <w:sz w:val="20"/>
           <w:szCs w:val="20"/>
         </w:rPr>
-        <w:t>Comité de Cafeteros de Caldas  —  Área de Educación</w:t>
+        <w:t xml:space="preserve">Comité de Cafeteros de </w:t>
+      </w:r>
+      <w:r>
+        <w:rPr>
+          <w:b/>
+          <w:bCs/>
+          <w:color w:val="1A5E38"/>
+          <w:sz w:val="20"/>
+          <w:szCs w:val="20"/>
+        </w:rPr>
+        <w:t xml:space="preserve">Caldas </w:t>
+      </w:r>
+      <w:proofErr w:type="gramStart"/>
+      <w:r>
+        <w:rPr>
+          <w:b/>
+          <w:bCs/>
+          <w:color w:val="1A5E38"/>
+          <w:sz w:val="20"/>
+          <w:szCs w:val="20"/>
+        </w:rPr>
+        <w:t>—</w:t>
+      </w:r>
+      <w:r>
+        <w:rPr>
+          <w:b/>
+          <w:bCs/>
+          <w:color w:val="1A5E38"/>
+          <w:sz w:val="20"/>
+          <w:szCs w:val="20"/>
+        </w:rPr>
+        <w:t xml:space="preserve">  Área</w:t>
+      </w:r>
+      <w:proofErr w:type="gramEnd"/>
+      <w:r>
+        <w:rPr>
+          <w:b/>
+          <w:bCs/>
+          <w:color w:val="1A5E38"/>
+          <w:sz w:val="20"/>
+          <w:szCs w:val="20"/>
+        </w:rPr>
+        <w:t xml:space="preserve"> de Educación</w:t>
       </w:r>
     </w:p>
     <w:p>

</xml_diff>